<commit_message>
build(submission): consolidate HO_SO_NOP into clean single folder
- Remove 3 duplicate files introduced during prior rebuild
  (tom_tat_vi.docx, cd1_ctu_final_vi.docx, cd2_ctu_final_vi.docx);
  keep canonical names per assemble_submission_folder.sh
- Promote unified-CDCM-model content into canonical CD2_chuyen_de_2.docx
  (was stale with old figures); same for CD1_chuyen_de_1.docx
- Regenerate ALL 19 component PDFs + LUAN_AN_FULL_vi.pdf from current
  markdown sources via pandoc/xelatex so every PDF matches its DOCX:
  - chuong_2 + CD2 now embed the unified conceptual model (Hình 2.1)
  - P3-P8 EN PDFs reflect the LaTeX/academic-language fixes
- Add previously-missing LUAN_AN_FULL_vi.pdf
- Update manifest: 55 files, note CDCM embed

Bundle: 55 files, 21M, fully self-contained (dist/HO_SO_NOP.zip for handoff)

https://claude.ai/code/session_01TNqoRFY1vAVQL6GWg8X9M3
</commit_message>
<xml_diff>
--- a/dist/HO_SO_NOP/03_CHUYEN_DE/CD2_chuyen_de_2.docx
+++ b/dist/HO_SO_NOP/03_CHUYEN_DE/CD2_chuyen_de_2.docx
@@ -5447,7 +5447,7 @@
       <w:r>
         <w:drawing>
           <wp:inline>
-            <wp:extent cx="5753100" cy="4009802"/>
+            <wp:extent cx="5753100" cy="3860884"/>
             <wp:effectExtent b="0" l="0" r="0" t="0"/>
             <wp:docPr descr="Hình 2.1: Khung khái niệm tích hợp CĐ2" title="" id="46" name="Picture"/>
             <a:graphic>
@@ -5468,7 +5468,7 @@
                   <pic:spPr bwMode="auto">
                     <a:xfrm>
                       <a:off x="0" y="0"/>
-                      <a:ext cx="5753100" cy="4009802"/>
+                      <a:ext cx="5753100" cy="3860884"/>
                     </a:xfrm>
                     <a:prstGeom prst="rect">
                       <a:avLst/>
@@ -5510,7 +5510,31 @@
         <w:t xml:space="preserve"> </w:t>
       </w:r>
       <w:r>
-        <w:t xml:space="preserve">Khung khái niệm tích hợp Chuyên đề 2 (H1-H6, năm tầng lý thuyết).</w:t>
+        <w:t xml:space="preserve">Mô hình khái niệm thống nhất luận án (CDCM — Context-Contingent Digital-and-Capability Model). Hình chữ nhật biểu thị biến quan sát được; hình ellipse biểu thị cấu trúc tiềm ẩn (TCI, ICRV, DAI). H1a (+) và H1b (−) xác định quan hệ phi tuyến chữ U ngược (điểm uốn ≈ 36%; H1b điều kiện biên: SIDS/FIP âm đơn điệu). H2 TCI nâng mặt bằng hiệu quả. H3 DAI tái định hình đường cong phụ thuộc bối cảnh. H5 ICRV chi phối độ cong/biên độ. Mũi tên hai chiều đứt nét biểu thị thay thế số–thể chế (DAI×ICRV,</w:t>
+      </w:r>
+      <w:r>
+        <w:t xml:space="preserve"> </w:t>
+      </w:r>
+      <m:oMath>
+        <m:r>
+          <m:t>p</m:t>
+        </m:r>
+      </m:oMath>
+      <w:r>
+        <w:t xml:space="preserve"> </w:t>
+      </w:r>
+      <w:r>
+        <w:t xml:space="preserve">= ,049). Kiểm soát Bậc trên (H4) đưa vào như biến kiểm soát quản trị nội sinh.</w:t>
+      </w:r>
+      <w:r>
+        <w:t xml:space="preserve"> </w:t>
+      </w:r>
+      <w:r>
+        <w:rPr>
+          <w:iCs/>
+          <w:i/>
+        </w:rPr>
+        <w:t xml:space="preserve">Nguồn: tác giả tự xây dựng.</w:t>
       </w:r>
     </w:p>
     <w:p>
@@ -5586,7 +5610,7 @@
       <w:r>
         <w:drawing>
           <wp:inline>
-            <wp:extent cx="5753100" cy="2573755"/>
+            <wp:extent cx="5753100" cy="3860884"/>
             <wp:effectExtent b="0" l="0" r="0" t="0"/>
             <wp:docPr descr="Hình 2.2: Cơ chế CDCM theo ba nhóm ICRV" title="" id="50" name="Picture"/>
             <a:graphic>
@@ -5607,7 +5631,7 @@
                   <pic:spPr bwMode="auto">
                     <a:xfrm>
                       <a:off x="0" y="0"/>
-                      <a:ext cx="5753100" cy="2573755"/>
+                      <a:ext cx="5753100" cy="3860884"/>
                     </a:xfrm>
                     <a:prstGeom prst="rect">
                       <a:avLst/>

</xml_diff>